<commit_message>
update: benefit 5.7, flii, document styling and security, mapping template complete benefit
</commit_message>
<xml_diff>
--- a/assets/monitoring_v3_template.docx
+++ b/assets/monitoring_v3_template.docx
@@ -317,6 +317,11 @@
               </w:rPr>
               <w:t>{{ t("Site Characterisation: Villages, Sub-District, District, Province") }}</w:t>
             </w:r>
+            <w:r>
+              <w:rPr>
+                <w:rtl w:val="0"/>
+              </w:rPr>
+            </w:r>
           </w:p>
         </w:tc>
       </w:tr>
@@ -389,6 +394,11 @@
               </w:rPr>
               <w:t>{{ t("Site Characterisation: Country") }}</w:t>
             </w:r>
+            <w:r>
+              <w:rPr>
+                <w:rtl w:val="0"/>
+              </w:rPr>
+            </w:r>
           </w:p>
         </w:tc>
       </w:tr>
@@ -534,6 +544,11 @@
               </w:rPr>
               <w:t>{{ t("User input: DD-Month-Year") }}</w:t>
             </w:r>
+            <w:r>
+              <w:rPr>
+                <w:rtl w:val="0"/>
+              </w:rPr>
+            </w:r>
           </w:p>
         </w:tc>
       </w:tr>
@@ -606,6 +621,11 @@
               </w:rPr>
               <w:t>{{ t("User input: Name of Organisation/Institution/Entitiy") }}</w:t>
             </w:r>
+            <w:r>
+              <w:rPr>
+                <w:rtl w:val="0"/>
+              </w:rPr>
+            </w:r>
           </w:p>
         </w:tc>
       </w:tr>
@@ -678,6 +698,11 @@
               </w:rPr>
               <w:t>{{ t("User input: Physical Address") }}</w:t>
             </w:r>
+            <w:r>
+              <w:rPr>
+                <w:rtl w:val="0"/>
+              </w:rPr>
+            </w:r>
           </w:p>
           <w:p>
             <w:pPr>
@@ -699,6 +724,11 @@
               </w:rPr>
               <w:t>{{ t("User input: Telephone") }}</w:t>
             </w:r>
+            <w:r>
+              <w:rPr>
+                <w:rtl w:val="0"/>
+              </w:rPr>
+            </w:r>
           </w:p>
           <w:p>
             <w:pPr>
@@ -720,6 +750,11 @@
               </w:rPr>
               <w:t>{{ t("User input: Email") }}</w:t>
             </w:r>
+            <w:r>
+              <w:rPr>
+                <w:rtl w:val="0"/>
+              </w:rPr>
+            </w:r>
           </w:p>
           <w:p>
             <w:pPr>
@@ -740,6 +775,11 @@
                 <w:rtl w:val="0"/>
               </w:rPr>
               <w:t>{{ t("User input: Website") }}</w:t>
+            </w:r>
+            <w:r>
+              <w:rPr>
+                <w:rtl w:val="0"/>
+              </w:rPr>
             </w:r>
           </w:p>
         </w:tc>
@@ -3183,7 +3223,214 @@
           <w:color w:val="000000"/>
           <w:rtl w:val="0"/>
         </w:rPr>
-        <w:t>The project is located in {{ t("Site Characterisation: Level 4") }} Village, {{ t("Site Characterisation: Level 3") }} Sub-District, {{ t("Site Characterisation: Level 2") }} District, {{ t("Site Characterisation: Level 1") }} Province, {{ t("Site Characterisation: Level 0") }} with an approximate area of {{ t("Site Characterisation: number of") }} Ha. Approximately {{ t("Site Characterisation: percentage of forest coverage number area") }} % of the area is forested, and the area also includes {{ t("Site Characterisation: percentage of peatland number area") }} % of peatland and {{ t("Site Characterisation: percentage of mangrove number area") }} % mangrove.  The area is home to {{ t("People: Total Population in The Project Area") }}, with a gender split of {{ t("People: Gender disaggregation within Project Area (% Male / % Female / % Other)") }} {{ t("Site Characterisation: name of majority indigenous territory") }}, which is also home to several communities of indigenous people from  {{ t("People: IP&amp;LC or Ethnicity Identification") }} group.</w:t>
+        <w:t xml:space="preserve">The project is located in </w:t>
+      </w:r>
+      <w:r>
+        <w:rPr>
+          <w:b w:val="1"/>
+          <w:bCs w:val="1"/>
+          <w:color w:val="077f68"/>
+          <w:rtl w:val="0"/>
+        </w:rPr>
+        <w:t>{{ t("Site Characterisation: Level 4") }}</w:t>
+      </w:r>
+      <w:r>
+        <w:rPr>
+          <w:color w:val="000000"/>
+          <w:rtl w:val="0"/>
+        </w:rPr>
+        <w:t xml:space="preserve"> Village, </w:t>
+      </w:r>
+      <w:r>
+        <w:rPr>
+          <w:b w:val="1"/>
+          <w:bCs w:val="1"/>
+          <w:color w:val="077f68"/>
+          <w:rtl w:val="0"/>
+        </w:rPr>
+        <w:t>{{ t("Site Characterisation: Level 3") }}</w:t>
+      </w:r>
+      <w:r>
+        <w:rPr>
+          <w:color w:val="000000"/>
+          <w:rtl w:val="0"/>
+        </w:rPr>
+        <w:t xml:space="preserve"> Sub-District, </w:t>
+      </w:r>
+      <w:r>
+        <w:rPr>
+          <w:b w:val="1"/>
+          <w:bCs w:val="1"/>
+          <w:color w:val="077f68"/>
+          <w:rtl w:val="0"/>
+        </w:rPr>
+        <w:t>{{ t("Site Characterisation: Level 2") }}</w:t>
+      </w:r>
+      <w:r>
+        <w:rPr>
+          <w:color w:val="000000"/>
+          <w:rtl w:val="0"/>
+        </w:rPr>
+        <w:t xml:space="preserve"> District, </w:t>
+      </w:r>
+      <w:r>
+        <w:rPr>
+          <w:b w:val="1"/>
+          <w:bCs w:val="1"/>
+          <w:color w:val="077f68"/>
+          <w:rtl w:val="0"/>
+        </w:rPr>
+        <w:t>{{ t("Site Characterisation: Level 1") }}</w:t>
+      </w:r>
+      <w:r>
+        <w:rPr>
+          <w:color w:val="000000"/>
+          <w:rtl w:val="0"/>
+        </w:rPr>
+        <w:t xml:space="preserve"> Province, </w:t>
+      </w:r>
+      <w:r>
+        <w:rPr>
+          <w:b w:val="1"/>
+          <w:bCs w:val="1"/>
+          <w:color w:val="077f68"/>
+          <w:rtl w:val="0"/>
+        </w:rPr>
+        <w:t>{{ t("Site Characterisation: Level 0") }}</w:t>
+      </w:r>
+      <w:r>
+        <w:rPr>
+          <w:color w:val="000000"/>
+          <w:rtl w:val="0"/>
+        </w:rPr>
+        <w:t xml:space="preserve"> with an approximate area of </w:t>
+      </w:r>
+      <w:r>
+        <w:rPr>
+          <w:b w:val="1"/>
+          <w:bCs w:val="1"/>
+          <w:color w:val="077f68"/>
+          <w:rtl w:val="0"/>
+        </w:rPr>
+        <w:t>{{ t("Site Characterisation: number of") }}</w:t>
+      </w:r>
+      <w:r>
+        <w:rPr>
+          <w:color w:val="000000"/>
+          <w:rtl w:val="0"/>
+        </w:rPr>
+        <w:t xml:space="preserve"> Ha. Approximately </w:t>
+      </w:r>
+      <w:r>
+        <w:rPr>
+          <w:b w:val="1"/>
+          <w:bCs w:val="1"/>
+          <w:color w:val="077f68"/>
+          <w:rtl w:val="0"/>
+        </w:rPr>
+        <w:t>{{ t("Site Characterisation: percentage of forest coverage number area") }}</w:t>
+      </w:r>
+      <w:r>
+        <w:rPr>
+          <w:color w:val="000000"/>
+          <w:rtl w:val="0"/>
+        </w:rPr>
+        <w:t xml:space="preserve"> % of the area is forested, and the area also includes </w:t>
+      </w:r>
+      <w:r>
+        <w:rPr>
+          <w:b w:val="1"/>
+          <w:bCs w:val="1"/>
+          <w:color w:val="077f68"/>
+          <w:rtl w:val="0"/>
+        </w:rPr>
+        <w:t>{{ t("Site Characterisation: percentage of peatland number area") }}</w:t>
+      </w:r>
+      <w:r>
+        <w:rPr>
+          <w:color w:val="000000"/>
+          <w:rtl w:val="0"/>
+        </w:rPr>
+        <w:t xml:space="preserve"> % of peatland and </w:t>
+      </w:r>
+      <w:r>
+        <w:rPr>
+          <w:b w:val="1"/>
+          <w:bCs w:val="1"/>
+          <w:color w:val="077f68"/>
+          <w:rtl w:val="0"/>
+        </w:rPr>
+        <w:t>{{ t("Site Characterisation: percentage of mangrove number area") }}</w:t>
+      </w:r>
+      <w:r>
+        <w:rPr>
+          <w:color w:val="000000"/>
+          <w:rtl w:val="0"/>
+        </w:rPr>
+        <w:t xml:space="preserve"> % mangrove.  The area is home to </w:t>
+      </w:r>
+      <w:r>
+        <w:rPr>
+          <w:b w:val="1"/>
+          <w:bCs w:val="1"/>
+          <w:rtl w:val="0"/>
+        </w:rPr>
+        <w:t>{{ t("People: Total Population in The Project Area") }}</w:t>
+      </w:r>
+      <w:r>
+        <w:rPr>
+          <w:color w:val="000000"/>
+          <w:rtl w:val="0"/>
+        </w:rPr>
+        <w:t xml:space="preserve">, with a gender split of </w:t>
+      </w:r>
+      <w:r>
+        <w:rPr>
+          <w:b w:val="1"/>
+          <w:bCs w:val="1"/>
+          <w:rtl w:val="0"/>
+        </w:rPr>
+        <w:t>{{ t("People: Gender disaggregation within Project Area (% Male / % Female / % Other)") }}</w:t>
+      </w:r>
+      <w:r>
+        <w:rPr>
+          <w:b w:val="1"/>
+          <w:bCs w:val="1"/>
+          <w:color w:val="000000"/>
+          <w:rtl w:val="0"/>
+        </w:rPr>
+        <w:t xml:space="preserve"> </w:t>
+      </w:r>
+      <w:r>
+        <w:rPr>
+          <w:b w:val="1"/>
+          <w:bCs w:val="1"/>
+          <w:color w:val="077f68"/>
+          <w:rtl w:val="0"/>
+        </w:rPr>
+        <w:t>{{ t("Site Characterisation: name of majority indigenous territory") }}</w:t>
+      </w:r>
+      <w:r>
+        <w:rPr>
+          <w:color w:val="000000"/>
+          <w:rtl w:val="0"/>
+        </w:rPr>
+        <w:t xml:space="preserve">, which is also home to several communities of indigenous people from  </w:t>
+      </w:r>
+      <w:r>
+        <w:rPr>
+          <w:b w:val="1"/>
+          <w:bCs w:val="1"/>
+          <w:rtl w:val="0"/>
+        </w:rPr>
+        <w:t>{{ t("People: IP&amp;LC or Ethnicity Identification") }}</w:t>
+      </w:r>
+      <w:r>
+        <w:rPr>
+          <w:color w:val="000000"/>
+          <w:rtl w:val="0"/>
+        </w:rPr>
+        <w:t xml:space="preserve"> group.</w:t>
       </w:r>
     </w:p>
     <w:p>
@@ -3198,7 +3445,87 @@
           <w:color w:val="000000"/>
           <w:rtl w:val="0"/>
         </w:rPr>
-        <w:t xml:space="preserve">The project area mainly consists of {{ t("Site Characterisation: elevation class") }}, with an average slope of approximately {{ t("Site Characterisation: percentage of slope number average") }}% that categorize as {{ t("Site Characterisation: slope categories") }}. The dominant land cover categories in the area are {{ t("Site Characterisation: top 3 land cover class") }}. In the past 10 years, deforestation rates have been roughly {{ t("Site Characterisation: historical deforestation rate") }}% per year. </w:t>
+        <w:t xml:space="preserve">The project area mainly consists of </w:t>
+      </w:r>
+      <w:r>
+        <w:rPr>
+          <w:b w:val="1"/>
+          <w:bCs w:val="1"/>
+          <w:color w:val="077f68"/>
+          <w:rtl w:val="0"/>
+        </w:rPr>
+        <w:t>{{ t("Site Characterisation: elevation class") }}</w:t>
+      </w:r>
+      <w:r>
+        <w:rPr>
+          <w:color w:val="000000"/>
+          <w:rtl w:val="0"/>
+        </w:rPr>
+        <w:t xml:space="preserve">, with an average slope of approximately </w:t>
+      </w:r>
+      <w:r>
+        <w:rPr>
+          <w:b w:val="1"/>
+          <w:bCs w:val="1"/>
+          <w:color w:val="077f68"/>
+          <w:rtl w:val="0"/>
+        </w:rPr>
+        <w:t>{{ t("Site Characterisation: percentage of slope number average") }}</w:t>
+      </w:r>
+      <w:r>
+        <w:rPr>
+          <w:color w:val="000000"/>
+          <w:rtl w:val="0"/>
+        </w:rPr>
+        <w:t xml:space="preserve">% that categorize as </w:t>
+      </w:r>
+      <w:r>
+        <w:rPr>
+          <w:b w:val="1"/>
+          <w:bCs w:val="1"/>
+          <w:color w:val="077f68"/>
+          <w:rtl w:val="0"/>
+        </w:rPr>
+        <w:t>{{ t("Site Characterisation: slope categories") }}</w:t>
+      </w:r>
+      <w:r>
+        <w:rPr>
+          <w:color w:val="000000"/>
+          <w:rtl w:val="0"/>
+        </w:rPr>
+        <w:t xml:space="preserve">. The dominant land cover categories in the area are </w:t>
+      </w:r>
+      <w:r>
+        <w:rPr>
+          <w:b w:val="1"/>
+          <w:bCs w:val="1"/>
+          <w:color w:val="077f68"/>
+          <w:rtl w:val="0"/>
+        </w:rPr>
+        <w:t>{{ t("Site Characterisation: top 3 land cover class") }}</w:t>
+      </w:r>
+      <w:r>
+        <w:rPr>
+          <w:color w:val="000000"/>
+          <w:rtl w:val="0"/>
+        </w:rPr>
+        <w:t xml:space="preserve">. In the past 10 years, deforestation rates have been roughly </w:t>
+      </w:r>
+      <w:r>
+        <w:rPr>
+          <w:b w:val="1"/>
+          <w:bCs w:val="1"/>
+          <w:color w:val="077f68"/>
+          <w:rtl w:val="0"/>
+        </w:rPr>
+        <w:t>{{ t("Site Characterisation: historical deforestation rate") }}</w:t>
+      </w:r>
+      <w:r>
+        <w:rPr>
+          <w:color w:val="000000"/>
+          <w:rtl w:val="0"/>
+        </w:rPr>
+        <w:t xml:space="preserve">% per year. </w:t>
       </w:r>
     </w:p>
     <w:p>
@@ -3211,7 +3538,72 @@
           <w:color w:val="000000"/>
           <w:rtl w:val="0"/>
         </w:rPr>
-        <w:t>According to the Forest Landscape Integrity Index, the majority of forest in this region is categorized as {{ t("Nature: Integrity Category (High/Medium/Low/No forest cover)") }}, with an average score of {{ t("Nature: average of Forest Landscape Integrity Index score") }}/10. This area also holds {{ t("Nature: number of endangered tree species") }} of endangered tree species.</w:t>
+        <w:t xml:space="preserve">According to the Forest Landscape Integrity Index, the majority of forest in this region is categorized as </w:t>
+      </w:r>
+      <w:r>
+        <w:rPr>
+          <w:b w:val="1"/>
+          <w:bCs w:val="1"/>
+          <w:color w:val="077f68"/>
+          <w:rtl w:val="0"/>
+        </w:rPr>
+        <w:t>{{ t("Nature: Integrity Category (High/Medium/Low/No forest cover)") }}</w:t>
+      </w:r>
+      <w:r>
+        <w:rPr>
+          <w:color w:val="000000"/>
+          <w:rtl w:val="0"/>
+        </w:rPr>
+        <w:t xml:space="preserve">, with an average score of </w:t>
+      </w:r>
+      <w:r>
+        <w:rPr>
+          <w:b w:val="1"/>
+          <w:bCs w:val="1"/>
+          <w:color w:val="077f68"/>
+          <w:rtl w:val="0"/>
+        </w:rPr>
+        <w:t>{{ t("Nature: average of Forest Landscape Integrity Index score") }}</w:t>
+      </w:r>
+      <w:r>
+        <w:rPr>
+          <w:color w:val="000000"/>
+          <w:rtl w:val="0"/>
+        </w:rPr>
+        <w:t xml:space="preserve">/10. This area also holds </w:t>
+      </w:r>
+      <w:r>
+        <w:rPr>
+          <w:b w:val="1"/>
+          <w:bCs w:val="1"/>
+          <w:color w:val="077f68"/>
+          <w:rtl w:val="0"/>
+        </w:rPr>
+        <w:t>{{ t("Nature: number of endangered tree species") }}</w:t>
+      </w:r>
+      <w:r>
+        <w:rPr>
+          <w:color w:val="000000"/>
+          <w:rtl w:val="0"/>
+        </w:rPr>
+        <w:t xml:space="preserve"> of endangered tree species</w:t>
+      </w:r>
+      <w:r>
+        <w:rPr>
+          <w:b w:val="1"/>
+          <w:bCs w:val="1"/>
+          <w:color w:val="077f68"/>
+          <w:rtl w:val="0"/>
+        </w:rPr>
+        <w:t xml:space="preserve">.</w:t>
+      </w:r>
+      <w:r>
+        <w:br w:type="page"/>
+      </w:r>
+      <w:r>
+        <w:rPr>
+          <w:rtl w:val="0"/>
+        </w:rPr>
       </w:r>
     </w:p>
     <w:p>
@@ -3268,6 +3660,11 @@
         </w:rPr>
         <w:t>{{ t("Executive Summary") }}</w:t>
       </w:r>
+      <w:r>
+        <w:rPr>
+          <w:rtl w:val="0"/>
+        </w:rPr>
+      </w:r>
     </w:p>
     <w:p>
       <w:pPr>
@@ -3326,7 +3723,94 @@
           <w:color w:val="000000"/>
           <w:rtl w:val="0"/>
         </w:rPr>
-        <w:t>The project is led by {{ t("User input: Project Proponent") }}, a {{ t("User input: Legal Status of Proponent") }} with the management and financial capacity to implement the project. The proponent’s organisational structure comprises {{ t("User input: Organisation Structure / Subsidiaries") }}, and its management and financial track record is summarised in {{ t("User input: Management &amp; Financial Capacity Summary") }}.</w:t>
+        <w:t xml:space="preserve">The project is led by </w:t>
+      </w:r>
+      <w:r>
+        <w:rPr>
+          <w:b w:val="1"/>
+          <w:bCs w:val="1"/>
+          <w:color w:val="c00000"/>
+          <w:rtl w:val="0"/>
+        </w:rPr>
+        <w:t>{{ t("User input: Project Proponent") }}</w:t>
+      </w:r>
+      <w:r>
+        <w:rPr>
+          <w:color w:val="000000"/>
+          <w:rtl w:val="0"/>
+        </w:rPr>
+        <w:t xml:space="preserve">, a</w:t>
+      </w:r>
+      <w:r>
+        <w:rPr>
+          <w:rtl w:val="0"/>
+        </w:rPr>
+        <w:t xml:space="preserve"> </w:t>
+      </w:r>
+      <w:r>
+        <w:rPr>
+          <w:b w:val="1"/>
+          <w:bCs w:val="1"/>
+          <w:color w:val="c00000"/>
+          <w:rtl w:val="0"/>
+        </w:rPr>
+        <w:t>{{ t("User input: Legal Status of Proponent") }}</w:t>
+      </w:r>
+      <w:r>
+        <w:rPr>
+          <w:rtl w:val="0"/>
+        </w:rPr>
+        <w:t xml:space="preserve"> </w:t>
+      </w:r>
+      <w:r>
+        <w:rPr>
+          <w:color w:val="000000"/>
+          <w:rtl w:val="0"/>
+        </w:rPr>
+        <w:t xml:space="preserve">with the management and financial capacity to implement the project. The proponent’s organisational structure comprises</w:t>
+      </w:r>
+      <w:r>
+        <w:rPr>
+          <w:rtl w:val="0"/>
+        </w:rPr>
+        <w:t xml:space="preserve"> </w:t>
+      </w:r>
+      <w:r>
+        <w:rPr>
+          <w:b w:val="1"/>
+          <w:bCs w:val="1"/>
+          <w:color w:val="c00000"/>
+          <w:rtl w:val="0"/>
+        </w:rPr>
+        <w:t>{{ t("User input: Organisation Structure / Subsidiaries") }}</w:t>
+      </w:r>
+      <w:r>
+        <w:rPr>
+          <w:color w:val="000000"/>
+          <w:rtl w:val="0"/>
+        </w:rPr>
+        <w:t xml:space="preserve">, and its management and financial track record is summarised in</w:t>
+      </w:r>
+      <w:r>
+        <w:rPr>
+          <w:rtl w:val="0"/>
+        </w:rPr>
+        <w:t xml:space="preserve"> </w:t>
+      </w:r>
+      <w:r>
+        <w:rPr>
+          <w:b w:val="1"/>
+          <w:bCs w:val="1"/>
+          <w:color w:val="c00000"/>
+          <w:rtl w:val="0"/>
+        </w:rPr>
+        <w:t>{{ t("User input: Management &amp; Financial Capacity Summary") }}</w:t>
+      </w:r>
+      <w:r>
+        <w:rPr>
+          <w:rtl w:val="0"/>
+        </w:rPr>
+        <w:t xml:space="preserve">.</w:t>
       </w:r>
     </w:p>
     <w:p>
@@ -3402,7 +3886,188 @@
           <w:color w:val="000000"/>
           <w:rtl w:val="0"/>
         </w:rPr>
-        <w:t>The project targets a {{ t("Threat: Forest / Mangrove / Peatland") }} ecosystem, of which {{ t("NbS Pathway: hectare of remaining forest") }} hectares ({{ t("NbS Pathway: percentage of remaining forest") }}%) remain intact and {{ t("Threat: disturbed / degraded area (ha)") }} hectares ({{ t("Threat: percentage of disturbed area") }}%) are disturbed. Based on the NbS Pathway analysis, the project adopts a Protect / Manage / Restore approach, with {{ t("NbS Pathway: hectare area eligible to protect") }} hectares ({{ t("NbS Pathway: percent area eligible to protect") }}%) eligible to protect, {{ t("NbS Pathway: hectare area eligible to manage") }} hectares to manage and {{ t("NbS Pathway: hectare area eligible to restore") }} hectares to restore. Intervention activities are drawn from the NbS Activities Matrix ({{ t("NbS Pathway: Chosen NbS Activities") }}), over a protection duration of {{ t("NbS Pathway: Duration of protection (10–40 years, default 30)") }}.</w:t>
+        <w:t xml:space="preserve">The project targets a </w:t>
+      </w:r>
+      <w:r>
+        <w:rPr>
+          <w:b w:val="1"/>
+          <w:bCs w:val="1"/>
+          <w:color w:val="077f68"/>
+          <w:rtl w:val="0"/>
+        </w:rPr>
+        <w:t>{{ t("Threat: Forest / Mangrove / Peatland") }}</w:t>
+      </w:r>
+      <w:r>
+        <w:rPr>
+          <w:color w:val="000000"/>
+          <w:rtl w:val="0"/>
+        </w:rPr>
+        <w:t xml:space="preserve"> ecosystem, of which </w:t>
+      </w:r>
+      <w:r>
+        <w:rPr>
+          <w:b w:val="1"/>
+          <w:bCs w:val="1"/>
+          <w:color w:val="077f68"/>
+          <w:rtl w:val="0"/>
+        </w:rPr>
+        <w:t>{{ t("NbS Pathway: hectare of remaining forest") }}</w:t>
+      </w:r>
+      <w:r>
+        <w:rPr>
+          <w:color w:val="000000"/>
+          <w:rtl w:val="0"/>
+        </w:rPr>
+        <w:t xml:space="preserve"> hectares (</w:t>
+      </w:r>
+      <w:r>
+        <w:rPr>
+          <w:b w:val="1"/>
+          <w:bCs w:val="1"/>
+          <w:color w:val="077f68"/>
+          <w:rtl w:val="0"/>
+        </w:rPr>
+        <w:t>{{ t("NbS Pathway: percentage of remaining forest") }}</w:t>
+      </w:r>
+      <w:r>
+        <w:rPr>
+          <w:color w:val="000000"/>
+          <w:rtl w:val="0"/>
+        </w:rPr>
+        <w:t xml:space="preserve">%) remain intact and </w:t>
+      </w:r>
+      <w:r>
+        <w:rPr>
+          <w:b w:val="1"/>
+          <w:bCs w:val="1"/>
+          <w:color w:val="077f68"/>
+          <w:rtl w:val="0"/>
+        </w:rPr>
+        <w:t>{{ t("Threat: disturbed / degraded area (ha)") }}</w:t>
+      </w:r>
+      <w:r>
+        <w:rPr>
+          <w:color w:val="000000"/>
+          <w:rtl w:val="0"/>
+        </w:rPr>
+        <w:t xml:space="preserve"> hectares (</w:t>
+      </w:r>
+      <w:r>
+        <w:rPr>
+          <w:b w:val="1"/>
+          <w:bCs w:val="1"/>
+          <w:color w:val="077f68"/>
+          <w:rtl w:val="0"/>
+        </w:rPr>
+        <w:t>{{ t("Threat: percentage of disturbed area") }}</w:t>
+      </w:r>
+      <w:r>
+        <w:rPr>
+          <w:color w:val="000000"/>
+          <w:rtl w:val="0"/>
+        </w:rPr>
+        <w:t xml:space="preserve">%) are disturbed. Based on the NbS Pathway analysis, the project adopts a Protect / Manage / Restore approach, with </w:t>
+      </w:r>
+      <w:r>
+        <w:rPr>
+          <w:b w:val="1"/>
+          <w:bCs w:val="1"/>
+          <w:color w:val="077f68"/>
+          <w:rtl w:val="0"/>
+        </w:rPr>
+        <w:t>{{ t("NbS Pathway: hectare area eligible to protect") }}</w:t>
+      </w:r>
+      <w:r>
+        <w:rPr>
+          <w:color w:val="000000"/>
+          <w:rtl w:val="0"/>
+        </w:rPr>
+        <w:t xml:space="preserve"> hectares (</w:t>
+      </w:r>
+      <w:r>
+        <w:rPr>
+          <w:b w:val="1"/>
+          <w:bCs w:val="1"/>
+          <w:color w:val="077f68"/>
+          <w:rtl w:val="0"/>
+        </w:rPr>
+        <w:t>{{ t("NbS Pathway: percent area eligible to protect") }}</w:t>
+      </w:r>
+      <w:r>
+        <w:rPr>
+          <w:color w:val="000000"/>
+          <w:rtl w:val="0"/>
+        </w:rPr>
+        <w:t xml:space="preserve">%) eligible to protect, </w:t>
+      </w:r>
+      <w:r>
+        <w:rPr>
+          <w:b w:val="1"/>
+          <w:bCs w:val="1"/>
+          <w:color w:val="077f68"/>
+          <w:rtl w:val="0"/>
+        </w:rPr>
+        <w:t>{{ t("NbS Pathway: hectare area eligible to manage") }}</w:t>
+      </w:r>
+      <w:r>
+        <w:rPr>
+          <w:color w:val="000000"/>
+          <w:rtl w:val="0"/>
+        </w:rPr>
+        <w:t xml:space="preserve"> hectares to manage and </w:t>
+      </w:r>
+      <w:r>
+        <w:rPr>
+          <w:b w:val="1"/>
+          <w:bCs w:val="1"/>
+          <w:color w:val="077f68"/>
+          <w:rtl w:val="0"/>
+        </w:rPr>
+        <w:t>{{ t("NbS Pathway: hectare area eligible to restore") }}</w:t>
+      </w:r>
+      <w:r>
+        <w:rPr>
+          <w:color w:val="000000"/>
+          <w:rtl w:val="0"/>
+        </w:rPr>
+        <w:t xml:space="preserve"> hectares to restore. Intervention activities are drawn from the NbS Activities Matrix (</w:t>
+      </w:r>
+      <w:r>
+        <w:rPr>
+          <w:b w:val="1"/>
+          <w:bCs w:val="1"/>
+          <w:color w:val="077f68"/>
+          <w:rtl w:val="0"/>
+        </w:rPr>
+        <w:t>{{ t("NbS Pathway: Chosen NbS Activities") }}</w:t>
+      </w:r>
+      <w:r>
+        <w:rPr>
+          <w:color w:val="000000"/>
+          <w:rtl w:val="0"/>
+        </w:rPr>
+        <w:t xml:space="preserve">), over a protection duration of </w:t>
+      </w:r>
+      <w:r>
+        <w:rPr>
+          <w:b w:val="1"/>
+          <w:bCs w:val="1"/>
+          <w:color w:val="077f68"/>
+          <w:rtl w:val="0"/>
+        </w:rPr>
+        <w:t>{{ t("NbS Pathway: Duration of protection (10–40 years, default 30)") }}</w:t>
+      </w:r>
+      <w:r>
+        <w:rPr>
+          <w:color w:val="000000"/>
+          <w:rtl w:val="0"/>
+        </w:rPr>
+        <w:t xml:space="preserve">.</w:t>
+      </w:r>
+      <w:r>
+        <w:rPr>
+          <w:rtl w:val="0"/>
+        </w:rPr>
       </w:r>
     </w:p>
     <w:p>
@@ -3473,7 +4138,214 @@
           <w:color w:val="000000"/>
           <w:rtl w:val="0"/>
         </w:rPr>
-        <w:t>The project is located in {{ t("Site Characterisation: Level 4") }} Village, {{ t("Site Characterisation: Level 3") }} Sub-District, {{ t("Site Characterisation: Level 2") }} District, {{ t("Site Characterisation: Level 1") }} Province, {{ t("Site Characterisation: Level 0") }} with an approximate area of {{ t("Site Characterisation: number of") }} Ha. Approximately {{ t("Site Characterisation: percentage of forest coverage number area") }}% of the area is forested, and the area also includes {{ t("Site Characterisation: percentage of peatland number area") }}% of peatland and {{ t("Site Characterisation: percentage of mangrove number area") }}% mangrove. The area is home to {{ t("People: Total Population in The Project Area") }}, with a gender split of {{ t("People: Gender disaggregation within Project Area (% Male / % Female / % Other)") }} {{ t("Site Characterisation: name of majority indigenous territory") }}, which is also home to several communities of indigenous people with {{ t("People: IP&amp;LC or Ethnicity Identification") }}.</w:t>
+        <w:t xml:space="preserve">The project is located in </w:t>
+      </w:r>
+      <w:r>
+        <w:rPr>
+          <w:b w:val="1"/>
+          <w:bCs w:val="1"/>
+          <w:color w:val="077f68"/>
+          <w:rtl w:val="0"/>
+        </w:rPr>
+        <w:t>{{ t("Site Characterisation: Level 4") }}</w:t>
+      </w:r>
+      <w:r>
+        <w:rPr>
+          <w:color w:val="000000"/>
+          <w:rtl w:val="0"/>
+        </w:rPr>
+        <w:t xml:space="preserve"> Village, </w:t>
+      </w:r>
+      <w:r>
+        <w:rPr>
+          <w:b w:val="1"/>
+          <w:bCs w:val="1"/>
+          <w:color w:val="077f68"/>
+          <w:rtl w:val="0"/>
+        </w:rPr>
+        <w:t>{{ t("Site Characterisation: Level 3") }}</w:t>
+      </w:r>
+      <w:r>
+        <w:rPr>
+          <w:color w:val="000000"/>
+          <w:rtl w:val="0"/>
+        </w:rPr>
+        <w:t xml:space="preserve"> Sub-District, </w:t>
+      </w:r>
+      <w:r>
+        <w:rPr>
+          <w:b w:val="1"/>
+          <w:bCs w:val="1"/>
+          <w:color w:val="077f68"/>
+          <w:rtl w:val="0"/>
+        </w:rPr>
+        <w:t>{{ t("Site Characterisation: Level 2") }}</w:t>
+      </w:r>
+      <w:r>
+        <w:rPr>
+          <w:color w:val="000000"/>
+          <w:rtl w:val="0"/>
+        </w:rPr>
+        <w:t xml:space="preserve"> District, </w:t>
+      </w:r>
+      <w:r>
+        <w:rPr>
+          <w:b w:val="1"/>
+          <w:bCs w:val="1"/>
+          <w:color w:val="077f68"/>
+          <w:rtl w:val="0"/>
+        </w:rPr>
+        <w:t>{{ t("Site Characterisation: Level 1") }}</w:t>
+      </w:r>
+      <w:r>
+        <w:rPr>
+          <w:color w:val="000000"/>
+          <w:rtl w:val="0"/>
+        </w:rPr>
+        <w:t xml:space="preserve"> Province, </w:t>
+      </w:r>
+      <w:r>
+        <w:rPr>
+          <w:b w:val="1"/>
+          <w:bCs w:val="1"/>
+          <w:color w:val="077f68"/>
+          <w:rtl w:val="0"/>
+        </w:rPr>
+        <w:t>{{ t("Site Characterisation: Level 0") }}</w:t>
+      </w:r>
+      <w:r>
+        <w:rPr>
+          <w:color w:val="000000"/>
+          <w:rtl w:val="0"/>
+        </w:rPr>
+        <w:t xml:space="preserve"> with an approximate area of </w:t>
+      </w:r>
+      <w:r>
+        <w:rPr>
+          <w:b w:val="1"/>
+          <w:bCs w:val="1"/>
+          <w:color w:val="077f68"/>
+          <w:rtl w:val="0"/>
+        </w:rPr>
+        <w:t>{{ t("Site Characterisation: number of") }}</w:t>
+      </w:r>
+      <w:r>
+        <w:rPr>
+          <w:color w:val="000000"/>
+          <w:rtl w:val="0"/>
+        </w:rPr>
+        <w:t xml:space="preserve"> Ha. Approximately </w:t>
+      </w:r>
+      <w:r>
+        <w:rPr>
+          <w:b w:val="1"/>
+          <w:bCs w:val="1"/>
+          <w:color w:val="077f68"/>
+          <w:rtl w:val="0"/>
+        </w:rPr>
+        <w:t>{{ t("Site Characterisation: percentage of forest coverage number area") }}</w:t>
+      </w:r>
+      <w:r>
+        <w:rPr>
+          <w:color w:val="000000"/>
+          <w:rtl w:val="0"/>
+        </w:rPr>
+        <w:t xml:space="preserve">% of the area is forested, and the area also includes </w:t>
+      </w:r>
+      <w:r>
+        <w:rPr>
+          <w:b w:val="1"/>
+          <w:bCs w:val="1"/>
+          <w:color w:val="077f68"/>
+          <w:rtl w:val="0"/>
+        </w:rPr>
+        <w:t>{{ t("Site Characterisation: percentage of peatland number area") }}</w:t>
+      </w:r>
+      <w:r>
+        <w:rPr>
+          <w:color w:val="000000"/>
+          <w:rtl w:val="0"/>
+        </w:rPr>
+        <w:t xml:space="preserve">% of peatland and </w:t>
+      </w:r>
+      <w:r>
+        <w:rPr>
+          <w:b w:val="1"/>
+          <w:bCs w:val="1"/>
+          <w:color w:val="077f68"/>
+          <w:rtl w:val="0"/>
+        </w:rPr>
+        <w:t>{{ t("Site Characterisation: percentage of mangrove number area") }}</w:t>
+      </w:r>
+      <w:r>
+        <w:rPr>
+          <w:color w:val="000000"/>
+          <w:rtl w:val="0"/>
+        </w:rPr>
+        <w:t xml:space="preserve">% mangrove. The area is home to </w:t>
+      </w:r>
+      <w:r>
+        <w:rPr>
+          <w:b w:val="1"/>
+          <w:bCs w:val="1"/>
+          <w:rtl w:val="0"/>
+        </w:rPr>
+        <w:t>{{ t("People: Total Population in The Project Area") }}</w:t>
+      </w:r>
+      <w:r>
+        <w:rPr>
+          <w:color w:val="000000"/>
+          <w:rtl w:val="0"/>
+        </w:rPr>
+        <w:t xml:space="preserve">, with a gender split of </w:t>
+      </w:r>
+      <w:r>
+        <w:rPr>
+          <w:b w:val="1"/>
+          <w:bCs w:val="1"/>
+          <w:rtl w:val="0"/>
+        </w:rPr>
+        <w:t>{{ t("People: Gender disaggregation within Project Area (% Male / % Female / % Other)") }}</w:t>
+      </w:r>
+      <w:r>
+        <w:rPr>
+          <w:b w:val="1"/>
+          <w:bCs w:val="1"/>
+          <w:color w:val="000000"/>
+          <w:rtl w:val="0"/>
+        </w:rPr>
+        <w:t xml:space="preserve"> </w:t>
+      </w:r>
+      <w:r>
+        <w:rPr>
+          <w:b w:val="1"/>
+          <w:bCs w:val="1"/>
+          <w:color w:val="077f68"/>
+          <w:rtl w:val="0"/>
+        </w:rPr>
+        <w:t>{{ t("Site Characterisation: name of majority indigenous territory") }}</w:t>
+      </w:r>
+      <w:r>
+        <w:rPr>
+          <w:color w:val="000000"/>
+          <w:rtl w:val="0"/>
+        </w:rPr>
+        <w:t xml:space="preserve">, which is also home to several communities of indigenous people with </w:t>
+      </w:r>
+      <w:r>
+        <w:rPr>
+          <w:b w:val="1"/>
+          <w:bCs w:val="1"/>
+          <w:rtl w:val="0"/>
+        </w:rPr>
+        <w:t>{{ t("People: IP&amp;LC or Ethnicity Identification") }}</w:t>
+      </w:r>
+      <w:r>
+        <w:rPr>
+          <w:color w:val="000000"/>
+          <w:rtl w:val="0"/>
+        </w:rPr>
+        <w:t xml:space="preserve">.</w:t>
       </w:r>
     </w:p>
     <w:p>
@@ -3525,7 +4397,167 @@
           <w:color w:val="000000"/>
           <w:rtl w:val="0"/>
         </w:rPr>
-        <w:t xml:space="preserve">The project area mainly consists of {{ t("Site Characterisation: elevation class") }}, with an average slope of approximately {{ t("Site Characterisation: percentage of slope number average") }}% that categorises as {{ t("Site Characterisation: slope categories") }}. The full distribution of land cover across the project area is presented in Table 1, which lists each land cover class and its extent against the total area of interest (AOI); the dominant classes are {{ t("Site Characterisation: 1st land cover class") }}, followed by {{ t("Site Characterisation: 2nd land cover class") }} and {{ t("Site Characterisation: 3rd land cover class") }}. In the past 10 years, deforestation rates have been roughly {{ t("Site Characterisation: historical deforestation rate") }}% per year. Over the same period, fire history provides additional insights into disturbance patterns. Between 2014–2024, approximately {{ t("Site Characterisation: Historical Burned Area") }} ha of the project area was affected by fire, based on a 30 m-resolution global annual burned-area dataset (Zhang et al., 2025). Areas with frequent or extensive burning indicate higher degradation pressure and may face greater risks to the long-term success of restoration or carbon projects. These areas should be prioritized for fire prevention and early-warning measures.  </w:t>
+        <w:t xml:space="preserve">The project area mainly consists of </w:t>
+      </w:r>
+      <w:r>
+        <w:rPr>
+          <w:b w:val="1"/>
+          <w:bCs w:val="1"/>
+          <w:color w:val="077f68"/>
+          <w:rtl w:val="0"/>
+        </w:rPr>
+        <w:t>{{ t("Site Characterisation: elevation class") }}</w:t>
+      </w:r>
+      <w:r>
+        <w:rPr>
+          <w:color w:val="000000"/>
+          <w:rtl w:val="0"/>
+        </w:rPr>
+        <w:t xml:space="preserve">, with an average slope of approximately </w:t>
+      </w:r>
+      <w:r>
+        <w:rPr>
+          <w:b w:val="1"/>
+          <w:bCs w:val="1"/>
+          <w:color w:val="077f68"/>
+          <w:rtl w:val="0"/>
+        </w:rPr>
+        <w:t>{{ t("Site Characterisation: percentage of slope number average") }}</w:t>
+      </w:r>
+      <w:r>
+        <w:rPr>
+          <w:color w:val="000000"/>
+          <w:rtl w:val="0"/>
+        </w:rPr>
+        <w:t xml:space="preserve">% that categorises as </w:t>
+      </w:r>
+      <w:r>
+        <w:rPr>
+          <w:b w:val="1"/>
+          <w:bCs w:val="1"/>
+          <w:color w:val="077f68"/>
+          <w:rtl w:val="0"/>
+        </w:rPr>
+        <w:t>{{ t("Site Characterisation: slope categories") }}</w:t>
+      </w:r>
+      <w:r>
+        <w:rPr>
+          <w:color w:val="000000"/>
+          <w:rtl w:val="0"/>
+        </w:rPr>
+        <w:t xml:space="preserve">. The full distribution of land cover across the project area is presented in </w:t>
+      </w:r>
+      <w:r>
+        <w:rPr>
+          <w:rFonts w:ascii="Poppins" w:cs="Poppins" w:eastAsia="Poppins" w:hAnsi="Poppins"/>
+          <w:b w:val="1"/>
+          <w:bCs w:val="1"/>
+          <w:color w:val="000000"/>
+          <w:rtl w:val="0"/>
+        </w:rPr>
+        <w:t xml:space="preserve">Table 1</w:t>
+      </w:r>
+      <w:r>
+        <w:rPr>
+          <w:color w:val="000000"/>
+          <w:rtl w:val="0"/>
+        </w:rPr>
+        <w:t xml:space="preserve">, which lists each land cover class and its extent against the total area of interest (AOI); the dominant classes are </w:t>
+      </w:r>
+      <w:r>
+        <w:rPr>
+          <w:b w:val="1"/>
+          <w:bCs w:val="1"/>
+          <w:color w:val="077f68"/>
+          <w:rtl w:val="0"/>
+        </w:rPr>
+        <w:t>{{ t("Site Characterisation: 1st land cover class") }}</w:t>
+      </w:r>
+      <w:r>
+        <w:rPr>
+          <w:color w:val="000000"/>
+          <w:rtl w:val="0"/>
+        </w:rPr>
+        <w:t xml:space="preserve">, followed by </w:t>
+      </w:r>
+      <w:r>
+        <w:rPr>
+          <w:b w:val="1"/>
+          <w:bCs w:val="1"/>
+          <w:color w:val="077f68"/>
+          <w:rtl w:val="0"/>
+        </w:rPr>
+        <w:t>{{ t("Site Characterisation: 2nd land cover class") }}</w:t>
+      </w:r>
+      <w:r>
+        <w:rPr>
+          <w:color w:val="000000"/>
+          <w:rtl w:val="0"/>
+        </w:rPr>
+        <w:t xml:space="preserve"> and </w:t>
+      </w:r>
+      <w:r>
+        <w:rPr>
+          <w:b w:val="1"/>
+          <w:bCs w:val="1"/>
+          <w:color w:val="077f68"/>
+          <w:rtl w:val="0"/>
+        </w:rPr>
+        <w:t>{{ t("Site Characterisation: 3rd land cover class") }}</w:t>
+      </w:r>
+      <w:r>
+        <w:rPr>
+          <w:color w:val="000000"/>
+          <w:rtl w:val="0"/>
+        </w:rPr>
+        <w:t xml:space="preserve">. In the past 10 years, deforestation rates have been roughly </w:t>
+      </w:r>
+      <w:r>
+        <w:rPr>
+          <w:b w:val="1"/>
+          <w:bCs w:val="1"/>
+          <w:color w:val="077f68"/>
+          <w:rtl w:val="0"/>
+        </w:rPr>
+        <w:t>{{ t("Site Characterisation: historical deforestation rate") }}</w:t>
+      </w:r>
+      <w:r>
+        <w:rPr>
+          <w:color w:val="000000"/>
+          <w:rtl w:val="0"/>
+        </w:rPr>
+        <w:t xml:space="preserve">% per year. Over the same period, fire history provides additional insights into disturbance patterns. Between 2014–2024, approximately </w:t>
+      </w:r>
+      <w:r>
+        <w:rPr>
+          <w:rFonts w:ascii="Poppins" w:cs="Poppins" w:eastAsia="Poppins" w:hAnsi="Poppins"/>
+          <w:color w:val="077f68"/>
+          <w:rtl w:val="0"/>
+        </w:rPr>
+        <w:t>{{ t("Site Characterisation: Historical Burned Area") }}</w:t>
+      </w:r>
+      <w:r>
+        <w:rPr>
+          <w:color w:val="000000"/>
+          <w:rtl w:val="0"/>
+        </w:rPr>
+        <w:t xml:space="preserve"> ha of the project area was affected by fire, based on a 30 m-resolution global annual burned-area dataset (Zhang </w:t>
+      </w:r>
+      <w:r>
+        <w:rPr>
+          <w:i w:val="1"/>
+          <w:iCs w:val="1"/>
+          <w:color w:val="000000"/>
+          <w:rtl w:val="0"/>
+        </w:rPr>
+        <w:t xml:space="preserve">et al</w:t>
+      </w:r>
+      <w:r>
+        <w:rPr>
+          <w:color w:val="000000"/>
+          <w:rtl w:val="0"/>
+        </w:rPr>
+        <w:t xml:space="preserve">., 2025). Areas with frequent or extensive burning indicate higher degradation pressure and may face greater risks to the long-term success of restoration or carbon projects. These areas should be prioritized for fire prevention and early-warning measures.  </w:t>
       </w:r>
     </w:p>
     <w:p>
@@ -3945,6 +4977,11 @@
               </w:rPr>
               <w:t>{{ t("Site Characterisation: 2nd land cover class") }}</w:t>
             </w:r>
+            <w:r>
+              <w:rPr>
+                <w:rtl w:val="0"/>
+              </w:rPr>
+            </w:r>
           </w:p>
         </w:tc>
         <w:tc>
@@ -3978,6 +5015,11 @@
               </w:rPr>
               <w:t>{{ t("Site Characterisation: 2nd land cover class area (ha)") }}</w:t>
             </w:r>
+            <w:r>
+              <w:rPr>
+                <w:rtl w:val="0"/>
+              </w:rPr>
+            </w:r>
           </w:p>
         </w:tc>
         <w:tc>
@@ -4010,6 +5052,11 @@
                 <w:rtl w:val="0"/>
               </w:rPr>
               <w:t>{{ t("Site Characterisation: 2nd land cover class area (% of AOI)") }}</w:t>
+            </w:r>
+            <w:r>
+              <w:rPr>
+                <w:rtl w:val="0"/>
+              </w:rPr>
             </w:r>
           </w:p>
         </w:tc>
@@ -4083,6 +5130,11 @@
               </w:rPr>
               <w:t>{{ t("Site Characterisation: 3rd land cover class") }}</w:t>
             </w:r>
+            <w:r>
+              <w:rPr>
+                <w:rtl w:val="0"/>
+              </w:rPr>
+            </w:r>
           </w:p>
         </w:tc>
         <w:tc>
@@ -4116,6 +5168,11 @@
               </w:rPr>
               <w:t>{{ t("Site Characterisation: 3rd land cover class area (ha)") }}</w:t>
             </w:r>
+            <w:r>
+              <w:rPr>
+                <w:rtl w:val="0"/>
+              </w:rPr>
+            </w:r>
           </w:p>
         </w:tc>
         <w:tc>
@@ -4148,6 +5205,11 @@
                 <w:rtl w:val="0"/>
               </w:rPr>
               <w:t>{{ t("Site Characterisation: 3rd land cover class area (% of AOI)") }}</w:t>
+            </w:r>
+            <w:r>
+              <w:rPr>
+                <w:rtl w:val="0"/>
+              </w:rPr>
             </w:r>
           </w:p>
         </w:tc>
@@ -4771,7 +5833,184 @@
           <w:color w:val="000000"/>
           <w:rtl w:val="0"/>
         </w:rPr>
-        <w:t>Threat-profile screening characterises the project area by ecosystem and quantifies its disturbance over 2015–2024. The area is classified as {{ t("Threat: ecosystem (forest / mangrove / peatland)") }}, covering {{ t("Threat: total ecosystem area (ha)") }}, of which {{ t("Threat: disturbed / degraded area (ha)") }} is currently disturbed or degraded. The cover-change breakdown reports the {{ t("Threat: remaining intact cover (ha)") }}, the {{ t("Threat: disturbed / degraded area (ha)") }}, and the {{ t("Threat: forest disturbed and converted/loss (ha)") }}. The screening attributes this mainly to {{ t("Threat: Main pressure (Logging / Road access / Agriculture Expansion / Settlement / Mining / Coastal conversion / Drainage / risk)") }}. The spatial distribution of remaining, disturbed, lost and regained forest cover is shown in Figure 1. Where peatland is present, its degradation risk is rated separately: canal proximity {{ t("Threat: canal proximity (High / Moderate / Low)") }}, drainage pressure {{ t("Threat: drainage pressure (High / Moderate / Low)") }}, and fire risk {{ t("Threat: fire risk (High / Moderate / Low)") }}, since drainage and fire are the principal drivers of peat loss and emissions. As these results derive from remote screening, field verification is required to confirm the screening results.</w:t>
+        <w:t xml:space="preserve">Threat-profile screening characterises the project area by ecosystem and quantifies its disturbance over 2015–2024. The area is classified as </w:t>
+      </w:r>
+      <w:r>
+        <w:rPr>
+          <w:b w:val="1"/>
+          <w:bCs w:val="1"/>
+          <w:color w:val="077f68"/>
+          <w:rtl w:val="0"/>
+        </w:rPr>
+        <w:t>{{ t("Threat: ecosystem (forest / mangrove / peatland)") }}</w:t>
+      </w:r>
+      <w:r>
+        <w:rPr>
+          <w:color w:val="000000"/>
+          <w:rtl w:val="0"/>
+        </w:rPr>
+        <w:t xml:space="preserve">, covering </w:t>
+      </w:r>
+      <w:r>
+        <w:rPr>
+          <w:b w:val="1"/>
+          <w:bCs w:val="1"/>
+          <w:color w:val="077f68"/>
+          <w:rtl w:val="0"/>
+        </w:rPr>
+        <w:t>{{ t("Threat: total ecosystem area (ha)") }}</w:t>
+      </w:r>
+      <w:r>
+        <w:rPr>
+          <w:color w:val="000000"/>
+          <w:rtl w:val="0"/>
+        </w:rPr>
+        <w:t xml:space="preserve">, of which </w:t>
+      </w:r>
+      <w:r>
+        <w:rPr>
+          <w:b w:val="1"/>
+          <w:bCs w:val="1"/>
+          <w:color w:val="077f68"/>
+          <w:rtl w:val="0"/>
+        </w:rPr>
+        <w:t>{{ t("Threat: disturbed / degraded area (ha)") }}</w:t>
+      </w:r>
+      <w:r>
+        <w:rPr>
+          <w:color w:val="000000"/>
+          <w:rtl w:val="0"/>
+        </w:rPr>
+        <w:t xml:space="preserve"> is currently disturbed or degraded. The cover-change breakdown reports the </w:t>
+      </w:r>
+      <w:r>
+        <w:rPr>
+          <w:b w:val="1"/>
+          <w:bCs w:val="1"/>
+          <w:color w:val="077f68"/>
+          <w:rtl w:val="0"/>
+        </w:rPr>
+        <w:t>{{ t("Threat: remaining intact cover (ha)") }}</w:t>
+      </w:r>
+      <w:r>
+        <w:rPr>
+          <w:color w:val="000000"/>
+          <w:rtl w:val="0"/>
+        </w:rPr>
+        <w:t xml:space="preserve">, the </w:t>
+      </w:r>
+      <w:r>
+        <w:rPr>
+          <w:b w:val="1"/>
+          <w:bCs w:val="1"/>
+          <w:color w:val="077f68"/>
+          <w:rtl w:val="0"/>
+        </w:rPr>
+        <w:t>{{ t("Threat: disturbed / degraded area (ha)") }}</w:t>
+      </w:r>
+      <w:r>
+        <w:rPr>
+          <w:color w:val="000000"/>
+          <w:rtl w:val="0"/>
+        </w:rPr>
+        <w:t xml:space="preserve">, and the </w:t>
+      </w:r>
+      <w:r>
+        <w:rPr>
+          <w:b w:val="1"/>
+          <w:bCs w:val="1"/>
+          <w:color w:val="077f68"/>
+          <w:rtl w:val="0"/>
+        </w:rPr>
+        <w:t>{{ t("Threat: forest disturbed and converted/loss (ha)") }}</w:t>
+      </w:r>
+      <w:r>
+        <w:rPr>
+          <w:color w:val="000000"/>
+          <w:rtl w:val="0"/>
+        </w:rPr>
+        <w:t xml:space="preserve">. The screening attributes this mainly to </w:t>
+      </w:r>
+      <w:r>
+        <w:rPr>
+          <w:b w:val="1"/>
+          <w:bCs w:val="1"/>
+          <w:color w:val="077f68"/>
+          <w:rtl w:val="0"/>
+        </w:rPr>
+        <w:t>{{ t("Threat: Main pressure (Logging / Road access / Agriculture Expansion / Settlement / Mining / Coastal conversion / Drainage / risk)") }}</w:t>
+      </w:r>
+      <w:r>
+        <w:rPr>
+          <w:color w:val="000000"/>
+          <w:rtl w:val="0"/>
+        </w:rPr>
+        <w:t xml:space="preserve">. The spatial distribution of remaining, disturbed, lost and regained forest cover is shown in </w:t>
+      </w:r>
+      <w:r>
+        <w:rPr>
+          <w:rFonts w:ascii="Poppins" w:cs="Poppins" w:eastAsia="Poppins" w:hAnsi="Poppins"/>
+          <w:b w:val="1"/>
+          <w:bCs w:val="1"/>
+          <w:color w:val="000000"/>
+          <w:rtl w:val="0"/>
+        </w:rPr>
+        <w:t xml:space="preserve">Figure 1</w:t>
+      </w:r>
+      <w:r>
+        <w:rPr>
+          <w:color w:val="000000"/>
+          <w:rtl w:val="0"/>
+        </w:rPr>
+        <w:t xml:space="preserve">. Where peatland is present, its degradation risk is rated separately: canal proximity </w:t>
+      </w:r>
+      <w:r>
+        <w:rPr>
+          <w:b w:val="1"/>
+          <w:bCs w:val="1"/>
+          <w:color w:val="077f68"/>
+          <w:rtl w:val="0"/>
+        </w:rPr>
+        <w:t>{{ t("Threat: canal proximity (High / Moderate / Low)") }}</w:t>
+      </w:r>
+      <w:r>
+        <w:rPr>
+          <w:color w:val="000000"/>
+          <w:rtl w:val="0"/>
+        </w:rPr>
+        <w:t xml:space="preserve">, drainage pressure </w:t>
+      </w:r>
+      <w:r>
+        <w:rPr>
+          <w:b w:val="1"/>
+          <w:bCs w:val="1"/>
+          <w:color w:val="077f68"/>
+          <w:rtl w:val="0"/>
+        </w:rPr>
+        <w:t>{{ t("Threat: drainage pressure (High / Moderate / Low)") }}</w:t>
+      </w:r>
+      <w:r>
+        <w:rPr>
+          <w:color w:val="000000"/>
+          <w:rtl w:val="0"/>
+        </w:rPr>
+        <w:t xml:space="preserve">, and fire risk </w:t>
+      </w:r>
+      <w:r>
+        <w:rPr>
+          <w:b w:val="1"/>
+          <w:bCs w:val="1"/>
+          <w:color w:val="077f68"/>
+          <w:rtl w:val="0"/>
+        </w:rPr>
+        <w:t>{{ t("Threat: fire risk (High / Moderate / Low)") }}</w:t>
+      </w:r>
+      <w:r>
+        <w:rPr>
+          <w:color w:val="000000"/>
+          <w:rtl w:val="0"/>
+        </w:rPr>
+        <w:t xml:space="preserve">, since drainage and fire are the principal drivers of peat loss and emissions. As these results derive from remote screening, field verification is required to confirm the screening results.</w:t>
       </w:r>
     </w:p>
     <w:p>
@@ -5020,7 +6259,28 @@
           <w:color w:val="000000"/>
           <w:rtl w:val="0"/>
         </w:rPr>
-        <w:t>Figure 1. Ecosystem disturbance map of the project area, 2014–2024. Classes: remaining forest, disturbed, forest loss, forest gain. Source: Source: SCENE NbS Tool. Generated: {{ t("User input: date") }}.</w:t>
+        <w:t xml:space="preserve">Figure 1.</w:t>
+      </w:r>
+      <w:r>
+        <w:rPr>
+          <w:color w:val="000000"/>
+          <w:rtl w:val="0"/>
+        </w:rPr>
+        <w:t xml:space="preserve"> Ecosystem disturbance map of the project area, 2014–2024. Classes: remaining forest, disturbed, forest loss, forest gain. Source: Source: SCENE NbS Tool. Generated: </w:t>
+      </w:r>
+      <w:r>
+        <w:rPr>
+          <w:color w:val="c00000"/>
+          <w:rtl w:val="0"/>
+        </w:rPr>
+        <w:t>{{ t("User input: date") }}</w:t>
+      </w:r>
+      <w:r>
+        <w:rPr>
+          <w:color w:val="000000"/>
+          <w:rtl w:val="0"/>
+        </w:rPr>
+        <w:t xml:space="preserve">.</w:t>
       </w:r>
     </w:p>
     <w:p>
@@ -5244,7 +6504,102 @@
           <w:color w:val="000000"/>
           <w:rtl w:val="0"/>
         </w:rPr>
-        <w:t>Tenure over the project area is governed under {{ t("User input: Legal Tenure Regime / Land Status") }}, within which rights to private and community land are held through {{ t("User input: Formal and Customary Titles") }}. Management authority over the area is held by {{ t("User input: Rights Holder / Managing Institution") }} under {{ t("User input: Permit / Decree Reference") }} for a period of {{ t("User input: Tenure Duration (years)") }}. Customary claims within the landscape are associated with {{ t("People: IP&amp;LC or Ethnicity Identification") }}, whose recognition and role in project governance are documented in the stakeholder analysis.</w:t>
+        <w:t xml:space="preserve">Tenure over the project area is governed under </w:t>
+      </w:r>
+      <w:r>
+        <w:rPr>
+          <w:b w:val="1"/>
+          <w:bCs w:val="1"/>
+          <w:color w:val="c00000"/>
+          <w:rtl w:val="0"/>
+        </w:rPr>
+        <w:t>{{ t("User input: Legal Tenure Regime / Land Status") }}</w:t>
+      </w:r>
+      <w:r>
+        <w:rPr>
+          <w:color w:val="000000"/>
+          <w:rtl w:val="0"/>
+        </w:rPr>
+        <w:t xml:space="preserve">, within which rights to private and community land are held through </w:t>
+      </w:r>
+      <w:r>
+        <w:rPr>
+          <w:b w:val="1"/>
+          <w:bCs w:val="1"/>
+          <w:color w:val="c00000"/>
+          <w:rtl w:val="0"/>
+        </w:rPr>
+        <w:t>{{ t("User input: Formal and Customary Titles") }}</w:t>
+      </w:r>
+      <w:r>
+        <w:rPr>
+          <w:color w:val="000000"/>
+          <w:rtl w:val="0"/>
+        </w:rPr>
+        <w:t xml:space="preserve">. Management authority over the area is held by </w:t>
+      </w:r>
+      <w:r>
+        <w:rPr>
+          <w:b w:val="1"/>
+          <w:bCs w:val="1"/>
+          <w:color w:val="c00000"/>
+          <w:rtl w:val="0"/>
+        </w:rPr>
+        <w:t>{{ t("User input: Rights Holder / Managing Institution") }}</w:t>
+      </w:r>
+      <w:r>
+        <w:rPr>
+          <w:color w:val="000000"/>
+          <w:rtl w:val="0"/>
+        </w:rPr>
+        <w:t xml:space="preserve"> under </w:t>
+      </w:r>
+      <w:r>
+        <w:rPr>
+          <w:b w:val="1"/>
+          <w:bCs w:val="1"/>
+          <w:color w:val="c00000"/>
+          <w:rtl w:val="0"/>
+        </w:rPr>
+        <w:t>{{ t("User input: Permit / Decree Reference") }}</w:t>
+      </w:r>
+      <w:r>
+        <w:rPr>
+          <w:color w:val="000000"/>
+          <w:rtl w:val="0"/>
+        </w:rPr>
+        <w:t xml:space="preserve"> for a period of </w:t>
+      </w:r>
+      <w:r>
+        <w:rPr>
+          <w:b w:val="1"/>
+          <w:bCs w:val="1"/>
+          <w:color w:val="c00000"/>
+          <w:rtl w:val="0"/>
+        </w:rPr>
+        <w:t>{{ t("User input: Tenure Duration (years)") }}</w:t>
+      </w:r>
+      <w:r>
+        <w:rPr>
+          <w:color w:val="000000"/>
+          <w:rtl w:val="0"/>
+        </w:rPr>
+        <w:t xml:space="preserve">. Customary claims within the landscape are associated with </w:t>
+      </w:r>
+      <w:r>
+        <w:rPr>
+          <w:b w:val="1"/>
+          <w:bCs w:val="1"/>
+          <w:rtl w:val="0"/>
+        </w:rPr>
+        <w:t>{{ t("People: IP&amp;LC or Ethnicity Identification") }}</w:t>
+      </w:r>
+      <w:r>
+        <w:rPr>
+          <w:color w:val="000000"/>
+          <w:rtl w:val="0"/>
+        </w:rPr>
+        <w:t xml:space="preserve">, whose recognition and role in project governance are documented in the stakeholder analysis.</w:t>
       </w:r>
     </w:p>
     <w:p>
@@ -5260,7 +6615,119 @@
           <w:color w:val="000000"/>
           <w:rtl w:val="0"/>
         </w:rPr>
-        <w:t>Under {{ t("User input: Applicable Carbon-Rights Regulation") }}, the carbon rights arising from the project are held by {{ t("User input: Carbon Rights Holder") }}. A review of documented and contested legal rights to deforest the area indicates {{ t("User input: Documented / Contested Rights Status") }}. Project participants {{ t("User input: hold / can realistically obtain") }} legal or customary land titles sufficient to support the intended interventions, subject to {{ t("User input: Outstanding Title Actions") }}. Where changes in land use are proposed, an incentive or compensation strategy for rights holders is {{ t("User input: Compensation / Incentive Strategy") }}. Residual risks to the permanence of carbon benefits arising from tenure are assessed as {{ t("User input: Tenure-related Permanence Risk") }} and are addressed in the risk and mitigation section.</w:t>
+        <w:t xml:space="preserve">Under </w:t>
+      </w:r>
+      <w:r>
+        <w:rPr>
+          <w:b w:val="1"/>
+          <w:bCs w:val="1"/>
+          <w:color w:val="c00000"/>
+          <w:rtl w:val="0"/>
+        </w:rPr>
+        <w:t>{{ t("User input: Applicable Carbon-Rights Regulation") }}</w:t>
+      </w:r>
+      <w:r>
+        <w:rPr>
+          <w:color w:val="000000"/>
+          <w:rtl w:val="0"/>
+        </w:rPr>
+        <w:t xml:space="preserve">, the carbon rights arising from the project are held by </w:t>
+      </w:r>
+      <w:r>
+        <w:rPr>
+          <w:b w:val="1"/>
+          <w:bCs w:val="1"/>
+          <w:color w:val="c00000"/>
+          <w:rtl w:val="0"/>
+        </w:rPr>
+        <w:t>{{ t("User input: Carbon Rights Holder") }}</w:t>
+      </w:r>
+      <w:r>
+        <w:rPr>
+          <w:color w:val="000000"/>
+          <w:rtl w:val="0"/>
+        </w:rPr>
+        <w:t xml:space="preserve">. A review of documented and contested legal rights to deforest the area indicates </w:t>
+      </w:r>
+      <w:r>
+        <w:rPr>
+          <w:b w:val="1"/>
+          <w:bCs w:val="1"/>
+          <w:color w:val="c00000"/>
+          <w:rtl w:val="0"/>
+        </w:rPr>
+        <w:t>{{ t("User input: Documented / Contested Rights Status") }}</w:t>
+      </w:r>
+      <w:r>
+        <w:rPr>
+          <w:color w:val="000000"/>
+          <w:rtl w:val="0"/>
+        </w:rPr>
+        <w:t xml:space="preserve">. Project participants </w:t>
+      </w:r>
+      <w:r>
+        <w:rPr>
+          <w:b w:val="1"/>
+          <w:bCs w:val="1"/>
+          <w:color w:val="c00000"/>
+          <w:rtl w:val="0"/>
+        </w:rPr>
+        <w:t>{{ t("User input: hold / can realistically obtain") }}</w:t>
+      </w:r>
+      <w:r>
+        <w:rPr>
+          <w:color w:val="000000"/>
+          <w:rtl w:val="0"/>
+        </w:rPr>
+        <w:t xml:space="preserve"> legal or customary land titles sufficient to support the intended interventions, subject to </w:t>
+      </w:r>
+      <w:r>
+        <w:rPr>
+          <w:b w:val="1"/>
+          <w:bCs w:val="1"/>
+          <w:color w:val="c00000"/>
+          <w:rtl w:val="0"/>
+        </w:rPr>
+        <w:t>{{ t("User input: Outstanding Title Actions") }}</w:t>
+      </w:r>
+      <w:r>
+        <w:rPr>
+          <w:color w:val="000000"/>
+          <w:rtl w:val="0"/>
+        </w:rPr>
+        <w:t xml:space="preserve">. Where changes in land use are proposed, an incentive or compensation strategy for rights holders is </w:t>
+      </w:r>
+      <w:r>
+        <w:rPr>
+          <w:b w:val="1"/>
+          <w:bCs w:val="1"/>
+          <w:color w:val="c00000"/>
+          <w:rtl w:val="0"/>
+        </w:rPr>
+        <w:t>{{ t("User input: Compensation / Incentive Strategy") }}</w:t>
+      </w:r>
+      <w:r>
+        <w:rPr>
+          <w:color w:val="000000"/>
+          <w:rtl w:val="0"/>
+        </w:rPr>
+        <w:t xml:space="preserve">. Residual risks to the permanence of carbon benefits arising from tenure are assessed as </w:t>
+      </w:r>
+      <w:r>
+        <w:rPr>
+          <w:b w:val="1"/>
+          <w:bCs w:val="1"/>
+          <w:color w:val="c00000"/>
+          <w:rtl w:val="0"/>
+        </w:rPr>
+        <w:t>{{ t("User input: Tenure-related Permanence Risk") }}</w:t>
+      </w:r>
+      <w:r>
+        <w:rPr>
+          <w:color w:val="000000"/>
+          <w:rtl w:val="0"/>
+        </w:rPr>
+        <w:t xml:space="preserve"> and are addressed in the risk and mitigation section.</w:t>
       </w:r>
     </w:p>
     <w:p>
@@ -5480,7 +6947,87 @@
           <w:color w:val="000000"/>
           <w:rtl w:val="0"/>
         </w:rPr>
-        <w:t>The proposed project encompasses a total area of {{ t("Site Characterisation: Total Project Area in Hectares") }} hectares within {{ t("Site Characterisation: Administrative Location") }}, delineated by the boundaries shown in {{ t("Site Characterisation: Project Boundary Map") }}, with geographical coordinates provided in {{ t("Site Characterisation: Coordinates / Annex Reference") }}. Of this, approximately {{ t("Site Characterisation: Forest Area Directly Involved (ha)") }} hectares comprise forest directly involved in the project, based on the land-cover classification generated for the site.</w:t>
+        <w:t xml:space="preserve">The proposed project encompasses a total area of </w:t>
+      </w:r>
+      <w:r>
+        <w:rPr>
+          <w:b w:val="1"/>
+          <w:bCs w:val="1"/>
+          <w:color w:val="077f68"/>
+          <w:rtl w:val="0"/>
+        </w:rPr>
+        <w:t>{{ t("Site Characterisation: Total Project Area in Hectares") }}</w:t>
+      </w:r>
+      <w:r>
+        <w:rPr>
+          <w:color w:val="000000"/>
+          <w:rtl w:val="0"/>
+        </w:rPr>
+        <w:t xml:space="preserve"> hectares within </w:t>
+      </w:r>
+      <w:r>
+        <w:rPr>
+          <w:b w:val="1"/>
+          <w:bCs w:val="1"/>
+          <w:color w:val="077f68"/>
+          <w:rtl w:val="0"/>
+        </w:rPr>
+        <w:t>{{ t("Site Characterisation: Administrative Location") }}</w:t>
+      </w:r>
+      <w:r>
+        <w:rPr>
+          <w:color w:val="000000"/>
+          <w:rtl w:val="0"/>
+        </w:rPr>
+        <w:t xml:space="preserve">, delineated by the boundaries shown in </w:t>
+      </w:r>
+      <w:r>
+        <w:rPr>
+          <w:b w:val="1"/>
+          <w:bCs w:val="1"/>
+          <w:color w:val="077f68"/>
+          <w:rtl w:val="0"/>
+        </w:rPr>
+        <w:t>{{ t("Site Characterisation: Project Boundary Map") }}</w:t>
+      </w:r>
+      <w:r>
+        <w:rPr>
+          <w:color w:val="000000"/>
+          <w:rtl w:val="0"/>
+        </w:rPr>
+        <w:t xml:space="preserve">, with geographical coordinates provided in </w:t>
+      </w:r>
+      <w:r>
+        <w:rPr>
+          <w:b w:val="1"/>
+          <w:bCs w:val="1"/>
+          <w:color w:val="077f68"/>
+          <w:rtl w:val="0"/>
+        </w:rPr>
+        <w:t>{{ t("Site Characterisation: Coordinates / Annex Reference") }}</w:t>
+      </w:r>
+      <w:r>
+        <w:rPr>
+          <w:color w:val="000000"/>
+          <w:rtl w:val="0"/>
+        </w:rPr>
+        <w:t xml:space="preserve">. Of this, approximately </w:t>
+      </w:r>
+      <w:r>
+        <w:rPr>
+          <w:b w:val="1"/>
+          <w:bCs w:val="1"/>
+          <w:color w:val="077f68"/>
+          <w:rtl w:val="0"/>
+        </w:rPr>
+        <w:t>{{ t("Site Characterisation: Forest Area Directly Involved (ha)") }}</w:t>
+      </w:r>
+      <w:r>
+        <w:rPr>
+          <w:color w:val="000000"/>
+          <w:rtl w:val="0"/>
+        </w:rPr>
+        <w:t xml:space="preserve"> hectares comprise forest directly involved in the project, based on the land-cover classification generated for the site.</w:t>
       </w:r>
     </w:p>
     <w:p>
@@ -5496,7 +7043,68 @@
           <w:color w:val="000000"/>
           <w:rtl w:val="0"/>
         </w:rPr>
-        <w:t>The selected area encompasses {{ t("People: Number of Villages") }} village communities and a population estimated in {{ t("People: Year of Data Source") }} to be {{ t("People: Total Population in The Project Area") }} people. Project implementation is expected to involve approximately {{ t("User input: Number of Communities / Landowners Involved") }} communities and/or landowners, whose delimitation will inform baseline analysis, carbon quantification, and the design of project interventions.</w:t>
+        <w:t xml:space="preserve">The selected area encompasses </w:t>
+      </w:r>
+      <w:r>
+        <w:rPr>
+          <w:b w:val="1"/>
+          <w:bCs w:val="1"/>
+          <w:rtl w:val="0"/>
+        </w:rPr>
+        <w:t>{{ t("People: Number of Villages") }}</w:t>
+      </w:r>
+      <w:r>
+        <w:rPr>
+          <w:color w:val="000000"/>
+          <w:rtl w:val="0"/>
+        </w:rPr>
+        <w:t xml:space="preserve"> village communities and a population estimated in </w:t>
+      </w:r>
+      <w:r>
+        <w:rPr>
+          <w:b w:val="1"/>
+          <w:bCs w:val="1"/>
+          <w:rtl w:val="0"/>
+        </w:rPr>
+        <w:t>{{ t("People: Year of Data Source") }}</w:t>
+      </w:r>
+      <w:r>
+        <w:rPr>
+          <w:color w:val="000000"/>
+          <w:rtl w:val="0"/>
+        </w:rPr>
+        <w:t xml:space="preserve"> to be </w:t>
+      </w:r>
+      <w:r>
+        <w:rPr>
+          <w:b w:val="1"/>
+          <w:bCs w:val="1"/>
+          <w:rtl w:val="0"/>
+        </w:rPr>
+        <w:t>{{ t("People: Total Population in The Project Area") }}</w:t>
+      </w:r>
+      <w:r>
+        <w:rPr>
+          <w:color w:val="000000"/>
+          <w:rtl w:val="0"/>
+        </w:rPr>
+        <w:t xml:space="preserve"> people. Project implementation is expected to involve approximately </w:t>
+      </w:r>
+      <w:r>
+        <w:rPr>
+          <w:b w:val="1"/>
+          <w:bCs w:val="1"/>
+          <w:color w:val="c00000"/>
+          <w:rtl w:val="0"/>
+        </w:rPr>
+        <w:t>{{ t("User input: Number of Communities / Landowners Involved") }}</w:t>
+      </w:r>
+      <w:r>
+        <w:rPr>
+          <w:color w:val="000000"/>
+          <w:rtl w:val="0"/>
+        </w:rPr>
+        <w:t xml:space="preserve"> communities and/or landowners, whose delimitation will inform baseline analysis, carbon quantification, and the design of project interventions.</w:t>
       </w:r>
     </w:p>
     <w:p>
@@ -5789,6 +7397,11 @@
               </w:rPr>
               <w:t>{{ eco0.label }}</w:t>
             </w:r>
+            <w:r>
+              <w:rPr>
+                <w:rtl w:val="0"/>
+              </w:rPr>
+            </w:r>
           </w:p>
         </w:tc>
         <w:tc>
@@ -5867,6 +7480,11 @@
               </w:rPr>
               <w:t>{{ eco0.protect_ha }}</w:t>
             </w:r>
+            <w:r>
+              <w:rPr>
+                <w:rtl w:val="0"/>
+              </w:rPr>
+            </w:r>
           </w:p>
         </w:tc>
       </w:tr>
@@ -5977,6 +7595,11 @@
               </w:rPr>
               <w:t>{{ eco0.manage_ha }}</w:t>
             </w:r>
+            <w:r>
+              <w:rPr>
+                <w:rtl w:val="0"/>
+              </w:rPr>
+            </w:r>
           </w:p>
         </w:tc>
       </w:tr>
@@ -6087,6 +7710,11 @@
               </w:rPr>
               <w:t>{{ eco0.restore_ha }}</w:t>
             </w:r>
+            <w:r>
+              <w:rPr>
+                <w:rtl w:val="0"/>
+              </w:rPr>
+            </w:r>
           </w:p>
         </w:tc>
       </w:tr>
@@ -6196,6 +7824,11 @@
               </w:rPr>
               <w:t>{{ eco1.protect_ha }}</w:t>
             </w:r>
+            <w:r>
+              <w:rPr>
+                <w:rtl w:val="0"/>
+              </w:rPr>
+            </w:r>
           </w:p>
         </w:tc>
       </w:tr>
@@ -6297,6 +7930,11 @@
               </w:rPr>
               <w:t>{{ eco1.manage_ha }}</w:t>
             </w:r>
+            <w:r>
+              <w:rPr>
+                <w:rtl w:val="0"/>
+              </w:rPr>
+            </w:r>
           </w:p>
         </w:tc>
       </w:tr>
@@ -6398,6 +8036,11 @@
               </w:rPr>
               <w:t>{{ eco1.restore_ha }}</w:t>
             </w:r>
+            <w:r>
+              <w:rPr>
+                <w:rtl w:val="0"/>
+              </w:rPr>
+            </w:r>
           </w:p>
         </w:tc>
       </w:tr>
@@ -6507,6 +8150,11 @@
               </w:rPr>
               <w:t>{{ eco2.protect_ha }}</w:t>
             </w:r>
+            <w:r>
+              <w:rPr>
+                <w:rtl w:val="0"/>
+              </w:rPr>
+            </w:r>
           </w:p>
         </w:tc>
       </w:tr>
@@ -6608,6 +8256,11 @@
               </w:rPr>
               <w:t>{{ eco2.manage_ha }}</w:t>
             </w:r>
+            <w:r>
+              <w:rPr>
+                <w:rtl w:val="0"/>
+              </w:rPr>
+            </w:r>
           </w:p>
         </w:tc>
       </w:tr>
@@ -6708,6 +8361,11 @@
                 <w:rtl w:val="0"/>
               </w:rPr>
               <w:t>{{ eco2.restore_ha }}</w:t>
+            </w:r>
+            <w:r>
+              <w:rPr>
+                <w:rtl w:val="0"/>
+              </w:rPr>
             </w:r>
           </w:p>
         </w:tc>
@@ -6979,6 +8637,11 @@
               </w:rPr>
               <w:t>{{ eco0.label }}</w:t>
             </w:r>
+            <w:r>
+              <w:rPr>
+                <w:rtl w:val="0"/>
+              </w:rPr>
+            </w:r>
           </w:p>
         </w:tc>
         <w:tc>
@@ -7044,6 +8707,11 @@
                 <w:rtl w:val="0"/>
               </w:rPr>
               <w:t>{{ eco0.protect_ha }}</w:t>
+            </w:r>
+            <w:r>
+              <w:rPr>
+                <w:rtl w:val="0"/>
+              </w:rPr>
             </w:r>
           </w:p>
         </w:tc>
@@ -7179,6 +8847,11 @@
               </w:rPr>
               <w:t>{{ eco0.manage_ha }}</w:t>
             </w:r>
+            <w:r>
+              <w:rPr>
+                <w:rtl w:val="0"/>
+              </w:rPr>
+            </w:r>
           </w:p>
         </w:tc>
         <w:tc>
@@ -7313,6 +8986,11 @@
               </w:rPr>
               <w:t>{{ eco0.restore_ha }}</w:t>
             </w:r>
+            <w:r>
+              <w:rPr>
+                <w:rtl w:val="0"/>
+              </w:rPr>
+            </w:r>
           </w:p>
         </w:tc>
         <w:tc>
@@ -7460,6 +9138,11 @@
               </w:rPr>
               <w:t>{{ eco1.protect_ha }}</w:t>
             </w:r>
+            <w:r>
+              <w:rPr>
+                <w:rtl w:val="0"/>
+              </w:rPr>
+            </w:r>
           </w:p>
         </w:tc>
         <w:tc>
@@ -7598,6 +9281,11 @@
               </w:rPr>
               <w:t>{{ eco1.manage_ha }}</w:t>
             </w:r>
+            <w:r>
+              <w:rPr>
+                <w:rtl w:val="0"/>
+              </w:rPr>
+            </w:r>
           </w:p>
         </w:tc>
         <w:tc>
@@ -7736,6 +9424,11 @@
               </w:rPr>
               <w:t>{{ eco1.restore_ha }}</w:t>
             </w:r>
+            <w:r>
+              <w:rPr>
+                <w:rtl w:val="0"/>
+              </w:rPr>
+            </w:r>
           </w:p>
         </w:tc>
         <w:tc>
@@ -7883,6 +9576,11 @@
               </w:rPr>
               <w:t>{{ eco2.protect_ha }}</w:t>
             </w:r>
+            <w:r>
+              <w:rPr>
+                <w:rtl w:val="0"/>
+              </w:rPr>
+            </w:r>
           </w:p>
         </w:tc>
         <w:tc>
@@ -8021,6 +9719,11 @@
               </w:rPr>
               <w:t>{{ eco2.manage_ha }}</w:t>
             </w:r>
+            <w:r>
+              <w:rPr>
+                <w:rtl w:val="0"/>
+              </w:rPr>
+            </w:r>
           </w:p>
         </w:tc>
         <w:tc>
@@ -8158,6 +9861,11 @@
                 <w:rtl w:val="0"/>
               </w:rPr>
               <w:t>{{ eco2.restore_ha }}</w:t>
+            </w:r>
+            <w:r>
+              <w:rPr>
+                <w:rtl w:val="0"/>
+              </w:rPr>
             </w:r>
           </w:p>
         </w:tc>
@@ -8276,7 +9984,24 @@
           <w:color w:val="000000"/>
           <w:rtl w:val="0"/>
         </w:rPr>
-        <w:t>Activities: {{ eco0.activities_all }}</w:t>
+        <w:t xml:space="preserve">Activities:</w:t>
+      </w:r>
+      <w:r>
+        <w:rPr>
+          <w:rtl w:val="0"/>
+        </w:rPr>
+        <w:t xml:space="preserve"> </w:t>
+      </w:r>
+      <w:r>
+        <w:rPr>
+          <w:b w:val="1"/>
+          <w:bCs w:val="1"/>
+          <w:color w:val="077f68"/>
+          <w:sz w:val="20"/>
+          <w:szCs w:val="20"/>
+          <w:rtl w:val="0"/>
+        </w:rPr>
+        <w:t>{{ eco0.activities_all }}</w:t>
       </w:r>
     </w:p>
     <w:p>
@@ -9690,7 +11415,18 @@
         <w:rPr>
           <w:rtl w:val="0"/>
         </w:rPr>
-        <w:t>Activities: {{ eco1.activities_all }}</w:t>
+        <w:t xml:space="preserve">Activities: </w:t>
+      </w:r>
+      <w:r>
+        <w:rPr>
+          <w:b w:val="1"/>
+          <w:bCs w:val="1"/>
+          <w:color w:val="077f68"/>
+          <w:sz w:val="20"/>
+          <w:szCs w:val="20"/>
+          <w:rtl w:val="0"/>
+        </w:rPr>
+        <w:t>{{ eco1.activities_all }}</w:t>
       </w:r>
     </w:p>
     <w:p>
@@ -11081,7 +12817,18 @@
         <w:rPr>
           <w:rtl w:val="0"/>
         </w:rPr>
-        <w:t>Activities: {{ eco2.activities_all }}</w:t>
+        <w:t xml:space="preserve">Activities: </w:t>
+      </w:r>
+      <w:r>
+        <w:rPr>
+          <w:b w:val="1"/>
+          <w:bCs w:val="1"/>
+          <w:color w:val="077f68"/>
+          <w:sz w:val="20"/>
+          <w:szCs w:val="20"/>
+          <w:rtl w:val="0"/>
+        </w:rPr>
+        <w:t>{{ eco2.activities_all }}</w:t>
       </w:r>
     </w:p>
     <w:p>

</xml_diff>